<commit_message>
Updating the first weekly report (training canceled).
</commit_message>
<xml_diff>
--- a/Weekly Report/Shein_Assignment_Progress_Report_1.docx
+++ b/Weekly Report/Shein_Assignment_Progress_Report_1.docx
@@ -230,6 +230,27 @@
       </w:r>
       <w:r>
         <w:t>.</w:t>
+      </w:r>
+    </w:p>
+    <w:p>
+      <w:pPr>
+        <w:pStyle w:val="ListParagraph"/>
+        <w:numPr>
+          <w:ilvl w:val="0"/>
+          <w:numId w:val="11"/>
+        </w:numPr>
+      </w:pPr>
+      <w:r>
+        <w:t>Update as of Monday April 27</w:t>
+      </w:r>
+      <w:r>
+        <w:rPr>
+          <w:vertAlign w:val="superscript"/>
+        </w:rPr>
+        <w:t>th</w:t>
+      </w:r>
+      <w:r>
+        <w:t xml:space="preserve">: training was canceled so the request for 4 days have been rescinded. </w:t>
       </w:r>
     </w:p>
     <w:p>
@@ -295,6 +316,7 @@
     </w:p>
     <w:p>
       <w:r>
+        <w:lastRenderedPageBreak/>
         <w:t>The original issue encountered when reading the CSV with base R was the message that there were more columns than column names. This indicated that the raw file contained messy rows or inconsistent delimiters.</w:t>
       </w:r>
     </w:p>
@@ -303,7 +325,6 @@
         <w:pStyle w:val="Heading1"/>
       </w:pPr>
       <w:r>
-        <w:lastRenderedPageBreak/>
         <w:t>3. Reading and Exporting the Raw Data</w:t>
       </w:r>
     </w:p>
@@ -488,12 +509,12 @@
     </w:p>
     <w:p>
       <w:r>
+        <w:lastRenderedPageBreak/>
         <w:t>The extraction step produced a very large number of key value pairs, approximately 1.38 million rows. Since this was too large to review comfortably in Excel, the approach was adjusted.</w:t>
       </w:r>
     </w:p>
     <w:p>
       <w:r>
-        <w:lastRenderedPageBreak/>
         <w:t xml:space="preserve">Instead of exporting every extracted pair, summary tables were prepared to count unique attribute names, unique attribute values, and unique attribute name and value combinations. These were intended to be added to the </w:t>
       </w:r>
       <w:proofErr w:type="spellStart"/>

</xml_diff>

<commit_message>
Updated weekly report, training canceled.
</commit_message>
<xml_diff>
--- a/Weekly Report/Shein_Assignment_Progress_Report_1.docx
+++ b/Weekly Report/Shein_Assignment_Progress_Report_1.docx
@@ -250,7 +250,13 @@
         <w:t>th</w:t>
       </w:r>
       <w:r>
-        <w:t xml:space="preserve">: training was canceled so the request for 4 days have been rescinded. </w:t>
+        <w:t xml:space="preserve">: training was canceled so the request for 4 days </w:t>
+      </w:r>
+      <w:r>
+        <w:t>has</w:t>
+      </w:r>
+      <w:r>
+        <w:t xml:space="preserve"> been rescinded. </w:t>
       </w:r>
     </w:p>
     <w:p>

</xml_diff>